<commit_message>
Split 'Any special requests' into two dialogue lines
Co-Authored-By: Claude Sonnet 4.6 <noreply@anthropic.com>
</commit_message>
<xml_diff>
--- a/Chapter 2 - Mr Muscle - Corrected.docx
+++ b/Chapter 2 - Mr Muscle - Corrected.docx
@@ -414,13 +414,25 @@
       </w:pPr>
       <w:r>
         <w:rPr/>
-        <w:t>“</w:t>
-      </w:r>
-      <w:r>
-        <w:rPr/>
-        <w:t>Fuck. Fuck just about covers it.”</w:t>
-        <w:br/>
-        <w:t>“Any special requests. Nothing expensive. Nothing too noticeable. And it won’t be missed. And I’ll be round in about twenty minutes.”</w:t>
+        <w:t>“Any special requests.”</w:t>
+      </w:r>
+      <w:r>
+        <w:rPr/>
+      </w:r>
+    </w:p>
+    <w:p>
+      <w:pPr>
+        <w:pStyle w:val="Normal"/>
+        <w:bidi w:val="0"/>
+        <w:jc w:val="left"/>
+        <w:rPr/>
+      </w:pPr>
+      <w:r>
+        <w:rPr/>
+        <w:t>“Nothing expensive. Nothing too noticeable. And it won’t be missed. And I’ll be round in about twenty minutes.”</w:t>
+      </w:r>
+      <w:r>
+        <w:rPr/>
       </w:r>
     </w:p>
     <w:p>

</xml_diff>